<commit_message>
Projektbewertung aktualisiert (Punktesumme korrigiert)
</commit_message>
<xml_diff>
--- a/SWE2_Klausur4_Projektbewertung.docx
+++ b/SWE2_Klausur4_Projektbewertung.docx
@@ -1078,7 +1078,6 @@
                 <w:szCs w:val="22"/>
               </w:rPr>
             </w:pPr>
-            <w:proofErr w:type="spellStart"/>
             <w:r>
               <w:rPr>
                 <w:b/>
@@ -1087,7 +1086,6 @@
               </w:rPr>
               <w:t>WindowsForms</w:t>
             </w:r>
-            <w:proofErr w:type="spellEnd"/>
           </w:p>
           <w:p>
             <w:pPr>
@@ -1207,7 +1205,13 @@
               <w:rPr>
                 <w:szCs w:val="22"/>
               </w:rPr>
-              <w:t> 15</w:t>
+              <w:t> 1</w:t>
+            </w:r>
+            <w:r>
+              <w:rPr>
+                <w:szCs w:val="22"/>
+              </w:rPr>
+              <w:t>0</w:t>
             </w:r>
           </w:p>
         </w:tc>
@@ -1851,7 +1855,6 @@
               </w:rPr>
               <w:t xml:space="preserve">Zusammenarbeit </w:t>
             </w:r>
-            <w:proofErr w:type="spellStart"/>
             <w:proofErr w:type="gramStart"/>
             <w:r>
               <w:rPr>
@@ -1859,16 +1862,7 @@
                 <w:bCs/>
                 <w:szCs w:val="22"/>
               </w:rPr>
-              <w:t>Git</w:t>
-            </w:r>
-            <w:proofErr w:type="spellEnd"/>
-            <w:r>
-              <w:rPr>
-                <w:b/>
-                <w:bCs/>
-                <w:szCs w:val="22"/>
-              </w:rPr>
-              <w:t>(</w:t>
+              <w:t>Git(</w:t>
             </w:r>
             <w:proofErr w:type="gramEnd"/>
             <w:r>
@@ -2089,19 +2083,11 @@
                 <w:szCs w:val="22"/>
               </w:rPr>
             </w:pPr>
-            <w:proofErr w:type="spellStart"/>
-            <w:r>
-              <w:rPr>
-                <w:szCs w:val="22"/>
-              </w:rPr>
-              <w:t>ReadMe</w:t>
-            </w:r>
-            <w:proofErr w:type="spellEnd"/>
-            <w:r>
-              <w:rPr>
-                <w:szCs w:val="22"/>
-              </w:rPr>
-              <w:t xml:space="preserve"> mit den wichtigsten Infos befüllt</w:t>
+            <w:r>
+              <w:rPr>
+                <w:szCs w:val="22"/>
+              </w:rPr>
+              <w:t>ReadMe mit den wichtigsten Infos befüllt</w:t>
             </w:r>
           </w:p>
         </w:tc>
@@ -2274,129 +2260,65 @@
                 <w:szCs w:val="22"/>
               </w:rPr>
             </w:pPr>
-            <w:proofErr w:type="spellStart"/>
             <w:r>
               <w:rPr>
                 <w:b/>
                 <w:bCs/>
                 <w:szCs w:val="22"/>
               </w:rPr>
-              <w:t>Commits</w:t>
-            </w:r>
-            <w:proofErr w:type="spellEnd"/>
-            <w:r>
-              <w:rPr>
-                <w:b/>
-                <w:bCs/>
-                <w:szCs w:val="22"/>
-              </w:rPr>
-              <w:t xml:space="preserve"> &amp; </w:t>
-            </w:r>
-            <w:proofErr w:type="spellStart"/>
-            <w:r>
-              <w:rPr>
-                <w:b/>
-                <w:bCs/>
-                <w:szCs w:val="22"/>
-              </w:rPr>
-              <w:t>Branches</w:t>
-            </w:r>
-            <w:proofErr w:type="spellEnd"/>
-          </w:p>
-          <w:p>
-            <w:pPr>
-              <w:tabs>
-                <w:tab w:val="left" w:pos="3449"/>
-                <w:tab w:val="left" w:pos="4111"/>
-              </w:tabs>
-              <w:rPr>
-                <w:szCs w:val="22"/>
-              </w:rPr>
-            </w:pPr>
-            <w:r>
-              <w:rPr>
-                <w:szCs w:val="22"/>
-              </w:rPr>
-              <w:t xml:space="preserve">Sinnvolle </w:t>
-            </w:r>
-            <w:proofErr w:type="spellStart"/>
-            <w:r>
-              <w:rPr>
-                <w:szCs w:val="22"/>
-              </w:rPr>
-              <w:t>Commits</w:t>
-            </w:r>
-            <w:proofErr w:type="spellEnd"/>
-            <w:r>
-              <w:rPr>
-                <w:szCs w:val="22"/>
-              </w:rPr>
-              <w:t xml:space="preserve"> und passende </w:t>
-            </w:r>
-            <w:proofErr w:type="spellStart"/>
-            <w:r>
-              <w:rPr>
-                <w:szCs w:val="22"/>
-              </w:rPr>
-              <w:t>Commitnachrichten</w:t>
-            </w:r>
-            <w:proofErr w:type="spellEnd"/>
-          </w:p>
-          <w:p>
-            <w:pPr>
-              <w:tabs>
-                <w:tab w:val="left" w:pos="3449"/>
-                <w:tab w:val="left" w:pos="4111"/>
-              </w:tabs>
-              <w:rPr>
-                <w:szCs w:val="22"/>
-              </w:rPr>
-            </w:pPr>
-            <w:r>
-              <w:rPr>
-                <w:szCs w:val="22"/>
-              </w:rPr>
-              <w:t xml:space="preserve">Arbeit in </w:t>
-            </w:r>
-            <w:proofErr w:type="spellStart"/>
-            <w:r>
-              <w:rPr>
-                <w:szCs w:val="22"/>
-              </w:rPr>
-              <w:t>Branches</w:t>
-            </w:r>
-            <w:proofErr w:type="spellEnd"/>
-            <w:r>
-              <w:rPr>
-                <w:szCs w:val="22"/>
-              </w:rPr>
-              <w:t xml:space="preserve"> („Experiment“ oder „Person)</w:t>
-            </w:r>
-          </w:p>
-          <w:p>
-            <w:pPr>
-              <w:tabs>
-                <w:tab w:val="left" w:pos="3449"/>
-                <w:tab w:val="left" w:pos="4111"/>
-              </w:tabs>
-              <w:rPr>
-                <w:szCs w:val="22"/>
-              </w:rPr>
-            </w:pPr>
-            <w:r>
-              <w:rPr>
-                <w:szCs w:val="22"/>
-              </w:rPr>
-              <w:t>Main-Branch enthält nur Merge-</w:t>
-            </w:r>
-            <w:proofErr w:type="spellStart"/>
-            <w:r>
-              <w:rPr>
-                <w:szCs w:val="22"/>
-              </w:rPr>
-              <w:t>Commits</w:t>
-            </w:r>
-            <w:proofErr w:type="spellEnd"/>
+              <w:t>Commits &amp; Branches</w:t>
+            </w:r>
+          </w:p>
+          <w:p>
+            <w:pPr>
+              <w:tabs>
+                <w:tab w:val="left" w:pos="3449"/>
+                <w:tab w:val="left" w:pos="4111"/>
+              </w:tabs>
+              <w:rPr>
+                <w:szCs w:val="22"/>
+              </w:rPr>
+            </w:pPr>
+            <w:r>
+              <w:rPr>
+                <w:szCs w:val="22"/>
+              </w:rPr>
+              <w:t>Sinnvolle Commits und passende Commitnachrichten</w:t>
+            </w:r>
+          </w:p>
+          <w:p>
+            <w:pPr>
+              <w:tabs>
+                <w:tab w:val="left" w:pos="3449"/>
+                <w:tab w:val="left" w:pos="4111"/>
+              </w:tabs>
+              <w:rPr>
+                <w:szCs w:val="22"/>
+              </w:rPr>
+            </w:pPr>
+            <w:r>
+              <w:rPr>
+                <w:szCs w:val="22"/>
+              </w:rPr>
+              <w:t>Arbeit in Branches („Experiment“ oder „Person)</w:t>
+            </w:r>
+          </w:p>
+          <w:p>
+            <w:pPr>
+              <w:tabs>
+                <w:tab w:val="left" w:pos="3449"/>
+                <w:tab w:val="left" w:pos="4111"/>
+              </w:tabs>
+              <w:rPr>
+                <w:szCs w:val="22"/>
+              </w:rPr>
+            </w:pPr>
+            <w:r>
+              <w:rPr>
+                <w:szCs w:val="22"/>
+              </w:rPr>
+              <w:t>Main-Branch enthält nur Merge-Commits</w:t>
+            </w:r>
           </w:p>
         </w:tc>
         <w:tc>
@@ -2496,59 +2418,29 @@
                 <w:szCs w:val="22"/>
               </w:rPr>
             </w:pPr>
-            <w:proofErr w:type="spellStart"/>
-            <w:r>
-              <w:rPr>
-                <w:szCs w:val="22"/>
-              </w:rPr>
-              <w:t>Commits</w:t>
-            </w:r>
-            <w:proofErr w:type="spellEnd"/>
-            <w:r>
-              <w:rPr>
-                <w:szCs w:val="22"/>
-              </w:rPr>
-              <w:t xml:space="preserve"> in </w:t>
-            </w:r>
-            <w:proofErr w:type="spellStart"/>
-            <w:r>
-              <w:rPr>
-                <w:szCs w:val="22"/>
-              </w:rPr>
-              <w:t>main</w:t>
-            </w:r>
-            <w:proofErr w:type="spellEnd"/>
-            <w:r>
-              <w:rPr>
-                <w:szCs w:val="22"/>
-              </w:rPr>
-              <w:t>: Planungs- und Entwurfsdokumente,</w:t>
-            </w:r>
-          </w:p>
-          <w:p>
-            <w:pPr>
-              <w:tabs>
-                <w:tab w:val="left" w:pos="3449"/>
-                <w:tab w:val="left" w:pos="4111"/>
-              </w:tabs>
-              <w:rPr>
-                <w:szCs w:val="22"/>
-              </w:rPr>
-            </w:pPr>
-            <w:r>
-              <w:rPr>
-                <w:szCs w:val="22"/>
-              </w:rPr>
-              <w:t>Sonst nur Merge--</w:t>
-            </w:r>
-            <w:proofErr w:type="spellStart"/>
-            <w:r>
-              <w:rPr>
-                <w:szCs w:val="22"/>
-              </w:rPr>
-              <w:t>Commits</w:t>
-            </w:r>
-            <w:proofErr w:type="spellEnd"/>
+            <w:r>
+              <w:rPr>
+                <w:szCs w:val="22"/>
+              </w:rPr>
+              <w:t>Commits in main: Planungs- und Entwurfsdokumente,</w:t>
+            </w:r>
+          </w:p>
+          <w:p>
+            <w:pPr>
+              <w:tabs>
+                <w:tab w:val="left" w:pos="3449"/>
+                <w:tab w:val="left" w:pos="4111"/>
+              </w:tabs>
+              <w:rPr>
+                <w:szCs w:val="22"/>
+              </w:rPr>
+            </w:pPr>
+            <w:r>
+              <w:rPr>
+                <w:szCs w:val="22"/>
+              </w:rPr>
+              <w:t>Sonst nur Merge--Commits</w:t>
+            </w:r>
           </w:p>
         </w:tc>
       </w:tr>
@@ -6928,6 +6820,7 @@
   <w:style w:type="character" w:default="1" w:styleId="Absatz-Standardschriftart">
     <w:name w:val="Default Paragraph Font"/>
     <w:uiPriority w:val="1"/>
+    <w:semiHidden/>
     <w:unhideWhenUsed/>
   </w:style>
   <w:style w:type="table" w:default="1" w:styleId="NormaleTabelle">
@@ -7464,6 +7357,26 @@
 </file>
 
 <file path=customXml/item1.xml><?xml version="1.0" encoding="utf-8"?>
+<p:properties xmlns:p="http://schemas.microsoft.com/office/2006/metadata/properties" xmlns:xsi="http://www.w3.org/2001/XMLSchema-instance" xmlns:pc="http://schemas.microsoft.com/office/infopath/2007/PartnerControls">
+  <documentManagement>
+    <TaxCatchAll xmlns="75bbbc0f-8b65-433e-aee5-01fa35b453e8" xsi:nil="true"/>
+    <lcf76f155ced4ddcb4097134ff3c332f xmlns="18eb8cbc-be3b-4f77-b004-84c0dd024886">
+      <Terms xmlns="http://schemas.microsoft.com/office/infopath/2007/PartnerControls"/>
+    </lcf76f155ced4ddcb4097134ff3c332f>
+  </documentManagement>
+</p:properties>
+</file>
+
+<file path=customXml/item2.xml><?xml version="1.0" encoding="utf-8"?>
+<?mso-contentType ?>
+<FormTemplates xmlns="http://schemas.microsoft.com/sharepoint/v3/contenttype/forms">
+  <Display>DocumentLibraryForm</Display>
+  <Edit>DocumentLibraryForm</Edit>
+  <New>DocumentLibraryForm</New>
+</FormTemplates>
+</file>
+
+<file path=customXml/item3.xml><?xml version="1.0" encoding="utf-8"?>
 <ct:contentTypeSchema xmlns:ct="http://schemas.microsoft.com/office/2006/metadata/contentType" xmlns:ma="http://schemas.microsoft.com/office/2006/metadata/properties/metaAttributes" ct:_="" ma:_="" ma:contentTypeName="Dokument" ma:contentTypeID="0x0101008222CA67FD4B26498AE0BE8319BFCFED" ma:contentTypeVersion="14" ma:contentTypeDescription="Ein neues Dokument erstellen." ma:contentTypeScope="" ma:versionID="74ea656ccc2034922b529965b6d92eae">
   <xsd:schema xmlns:xsd="http://www.w3.org/2001/XMLSchema" xmlns:xs="http://www.w3.org/2001/XMLSchema" xmlns:p="http://schemas.microsoft.com/office/2006/metadata/properties" xmlns:ns2="18eb8cbc-be3b-4f77-b004-84c0dd024886" xmlns:ns3="75bbbc0f-8b65-433e-aee5-01fa35b453e8" targetNamespace="http://schemas.microsoft.com/office/2006/metadata/properties" ma:root="true" ma:fieldsID="5ca08b3b1bb2f18618cd59a32fa2530e" ns2:_="" ns3:_="">
     <xsd:import namespace="18eb8cbc-be3b-4f77-b004-84c0dd024886"/>
@@ -7692,31 +7605,30 @@
 </ct:contentTypeSchema>
 </file>
 
-<file path=customXml/item2.xml><?xml version="1.0" encoding="utf-8"?>
-<?mso-contentType ?>
-<FormTemplates xmlns="http://schemas.microsoft.com/sharepoint/v3/contenttype/forms">
-  <Display>DocumentLibraryForm</Display>
-  <Edit>DocumentLibraryForm</Edit>
-  <New>DocumentLibraryForm</New>
-</FormTemplates>
-</file>
-
-<file path=customXml/item3.xml><?xml version="1.0" encoding="utf-8"?>
-<p:properties xmlns:p="http://schemas.microsoft.com/office/2006/metadata/properties" xmlns:xsi="http://www.w3.org/2001/XMLSchema-instance" xmlns:pc="http://schemas.microsoft.com/office/infopath/2007/PartnerControls">
-  <documentManagement>
-    <TaxCatchAll xmlns="75bbbc0f-8b65-433e-aee5-01fa35b453e8" xsi:nil="true"/>
-    <lcf76f155ced4ddcb4097134ff3c332f xmlns="18eb8cbc-be3b-4f77-b004-84c0dd024886">
-      <Terms xmlns="http://schemas.microsoft.com/office/infopath/2007/PartnerControls"/>
-    </lcf76f155ced4ddcb4097134ff3c332f>
-  </documentManagement>
-</p:properties>
-</file>
-
 <file path=customXml/item4.xml><?xml version="1.0" encoding="utf-8"?>
 <b:Sources xmlns:b="http://schemas.openxmlformats.org/officeDocument/2006/bibliography" xmlns="http://schemas.openxmlformats.org/officeDocument/2006/bibliography" SelectedStyle="\APA.XSL" StyleName="APA"/>
 </file>
 
 <file path=customXml/itemProps1.xml><?xml version="1.0" encoding="utf-8"?>
+<ds:datastoreItem xmlns:ds="http://schemas.openxmlformats.org/officeDocument/2006/customXml" ds:itemID="{1AB95BF5-21CA-4E91-99EA-80896A58297C}">
+  <ds:schemaRefs>
+    <ds:schemaRef ds:uri="http://schemas.microsoft.com/office/2006/metadata/properties"/>
+    <ds:schemaRef ds:uri="http://schemas.microsoft.com/office/infopath/2007/PartnerControls"/>
+    <ds:schemaRef ds:uri="75bbbc0f-8b65-433e-aee5-01fa35b453e8"/>
+    <ds:schemaRef ds:uri="18eb8cbc-be3b-4f77-b004-84c0dd024886"/>
+  </ds:schemaRefs>
+</ds:datastoreItem>
+</file>
+
+<file path=customXml/itemProps2.xml><?xml version="1.0" encoding="utf-8"?>
+<ds:datastoreItem xmlns:ds="http://schemas.openxmlformats.org/officeDocument/2006/customXml" ds:itemID="{83FA9F2A-0883-4C33-AFC4-3382B5B91358}">
+  <ds:schemaRefs>
+    <ds:schemaRef ds:uri="http://schemas.microsoft.com/sharepoint/v3/contenttype/forms"/>
+  </ds:schemaRefs>
+</ds:datastoreItem>
+</file>
+
+<file path=customXml/itemProps3.xml><?xml version="1.0" encoding="utf-8"?>
 <ds:datastoreItem xmlns:ds="http://schemas.openxmlformats.org/officeDocument/2006/customXml" ds:itemID="{EF5BB26E-ACE6-4A98-BA8A-A8A4C975950D}">
   <ds:schemaRefs>
     <ds:schemaRef ds:uri="http://schemas.microsoft.com/office/2006/metadata/contentType"/>
@@ -7735,25 +7647,6 @@
 </ds:datastoreItem>
 </file>
 
-<file path=customXml/itemProps2.xml><?xml version="1.0" encoding="utf-8"?>
-<ds:datastoreItem xmlns:ds="http://schemas.openxmlformats.org/officeDocument/2006/customXml" ds:itemID="{83FA9F2A-0883-4C33-AFC4-3382B5B91358}">
-  <ds:schemaRefs>
-    <ds:schemaRef ds:uri="http://schemas.microsoft.com/sharepoint/v3/contenttype/forms"/>
-  </ds:schemaRefs>
-</ds:datastoreItem>
-</file>
-
-<file path=customXml/itemProps3.xml><?xml version="1.0" encoding="utf-8"?>
-<ds:datastoreItem xmlns:ds="http://schemas.openxmlformats.org/officeDocument/2006/customXml" ds:itemID="{1AB95BF5-21CA-4E91-99EA-80896A58297C}">
-  <ds:schemaRefs>
-    <ds:schemaRef ds:uri="http://schemas.microsoft.com/office/2006/metadata/properties"/>
-    <ds:schemaRef ds:uri="http://schemas.microsoft.com/office/infopath/2007/PartnerControls"/>
-    <ds:schemaRef ds:uri="75bbbc0f-8b65-433e-aee5-01fa35b453e8"/>
-    <ds:schemaRef ds:uri="18eb8cbc-be3b-4f77-b004-84c0dd024886"/>
-  </ds:schemaRefs>
-</ds:datastoreItem>
-</file>
-
 <file path=customXml/itemProps4.xml><?xml version="1.0" encoding="utf-8"?>
 <ds:datastoreItem xmlns:ds="http://schemas.openxmlformats.org/officeDocument/2006/customXml" ds:itemID="{998A4EF7-E8EF-4259-92BB-291D973D6013}">
   <ds:schemaRefs>

</xml_diff>